<commit_message>
actualizacion del anexo 4
</commit_message>
<xml_diff>
--- a/ANEXOS/ANEXO4_Planificacion_y_PuntoControl (1).docx
+++ b/ANEXOS/ANEXO4_Planificacion_y_PuntoControl (1).docx
@@ -1169,8 +1169,6 @@
               </w:rPr>
               <w:t>Igor ha terminado su parte de la app del admin y yo he empezado y estoy haciendo la ventana de gestor de actividades.</w:t>
             </w:r>
-            <w:bookmarkStart w:id="0" w:name="_GoBack"/>
-            <w:bookmarkEnd w:id="0"/>
           </w:p>
         </w:tc>
         <w:tc>
@@ -1185,6 +1183,9 @@
             </w:pPr>
             <w:r>
               <w:t xml:space="preserve">Día </w:t>
+            </w:r>
+            <w:r>
+              <w:t>08/05/2026 (viernes)</w:t>
             </w:r>
           </w:p>
           <w:p/>
@@ -1201,6 +1202,14 @@
                 <w:b/>
               </w:rPr>
             </w:pPr>
+            <w:r>
+              <w:rPr>
+                <w:i/>
+                <w:sz w:val="18"/>
+                <w:szCs w:val="18"/>
+              </w:rPr>
+              <w:t>Igor termino la aplicación, la parte de clientes.</w:t>
+            </w:r>
           </w:p>
         </w:tc>
         <w:tc>
@@ -1216,6 +1225,15 @@
             <w:r>
               <w:t xml:space="preserve">Día </w:t>
             </w:r>
+            <w:r>
+              <w:t>11</w:t>
+            </w:r>
+            <w:r>
+              <w:t>/05/2026</w:t>
+            </w:r>
+            <w:r>
+              <w:t xml:space="preserve"> (lunes)</w:t>
+            </w:r>
           </w:p>
           <w:p>
             <w:pPr>
@@ -1223,6 +1241,37 @@
                 <w:b/>
               </w:rPr>
             </w:pPr>
+          </w:p>
+          <w:p>
+            <w:pPr>
+              <w:rPr>
+                <w:b/>
+              </w:rPr>
+            </w:pPr>
+            <w:r>
+              <w:rPr>
+                <w:i/>
+                <w:sz w:val="18"/>
+                <w:szCs w:val="18"/>
+              </w:rPr>
+              <w:t xml:space="preserve">Igor estuvo haciendo la parte de lmar y </w:t>
+            </w:r>
+            <w:r>
+              <w:rPr>
+                <w:i/>
+                <w:sz w:val="18"/>
+                <w:szCs w:val="18"/>
+              </w:rPr>
+              <w:t xml:space="preserve">Daniel estuvo </w:t>
+            </w:r>
+            <w:r>
+              <w:rPr>
+                <w:i/>
+                <w:sz w:val="18"/>
+                <w:szCs w:val="18"/>
+              </w:rPr>
+              <w:t>organizando las carpetas para que se viera mejor visualmente.</w:t>
+            </w:r>
           </w:p>
         </w:tc>
         <w:tc>
@@ -1238,6 +1287,15 @@
             <w:r>
               <w:t xml:space="preserve">Día </w:t>
             </w:r>
+            <w:r>
+              <w:t>12</w:t>
+            </w:r>
+            <w:r>
+              <w:t>/05/2026</w:t>
+            </w:r>
+            <w:r>
+              <w:t xml:space="preserve"> (martes)</w:t>
+            </w:r>
           </w:p>
           <w:p>
             <w:pPr>
@@ -1245,6 +1303,57 @@
                 <w:b/>
               </w:rPr>
             </w:pPr>
+          </w:p>
+          <w:p>
+            <w:pPr>
+              <w:rPr>
+                <w:b/>
+              </w:rPr>
+            </w:pPr>
+            <w:r>
+              <w:rPr>
+                <w:i/>
+                <w:sz w:val="18"/>
+                <w:szCs w:val="18"/>
+              </w:rPr>
+              <w:t xml:space="preserve">Daniel retomo lo que hizo Igor el </w:t>
+            </w:r>
+            <w:proofErr w:type="spellStart"/>
+            <w:r>
+              <w:rPr>
+                <w:i/>
+                <w:sz w:val="18"/>
+                <w:szCs w:val="18"/>
+              </w:rPr>
+              <w:t>dia</w:t>
+            </w:r>
+            <w:proofErr w:type="spellEnd"/>
+            <w:r>
+              <w:rPr>
+                <w:i/>
+                <w:sz w:val="18"/>
+                <w:szCs w:val="18"/>
+              </w:rPr>
+              <w:t xml:space="preserve"> anterior de lmar, y el botón para generar el </w:t>
+            </w:r>
+            <w:proofErr w:type="spellStart"/>
+            <w:r>
+              <w:rPr>
+                <w:i/>
+                <w:sz w:val="18"/>
+                <w:szCs w:val="18"/>
+              </w:rPr>
+              <w:t>xml</w:t>
+            </w:r>
+            <w:proofErr w:type="spellEnd"/>
+            <w:r>
+              <w:rPr>
+                <w:i/>
+                <w:sz w:val="18"/>
+                <w:szCs w:val="18"/>
+              </w:rPr>
+              <w:t xml:space="preserve"> para que Daniel pueda seguir haciendo lo de lmar.</w:t>
+            </w:r>
           </w:p>
         </w:tc>
       </w:tr>
@@ -1301,53 +1410,69 @@
             </w:pPr>
             <w:r>
               <w:lastRenderedPageBreak/>
-              <w:t>Día 6</w:t>
-            </w:r>
-          </w:p>
-          <w:p>
-            <w:pPr>
-              <w:rPr>
-                <w:i/>
-                <w:sz w:val="18"/>
-                <w:szCs w:val="18"/>
-              </w:rPr>
-            </w:pPr>
-          </w:p>
-          <w:p>
-            <w:pPr>
-              <w:rPr>
-                <w:i/>
-                <w:sz w:val="18"/>
-                <w:szCs w:val="18"/>
-              </w:rPr>
-            </w:pPr>
-          </w:p>
-          <w:p>
-            <w:pPr>
-              <w:rPr>
-                <w:i/>
-                <w:sz w:val="18"/>
-                <w:szCs w:val="18"/>
-              </w:rPr>
-            </w:pPr>
-          </w:p>
-          <w:p>
-            <w:pPr>
-              <w:rPr>
-                <w:i/>
-                <w:sz w:val="18"/>
-                <w:szCs w:val="18"/>
-              </w:rPr>
-            </w:pPr>
-          </w:p>
-          <w:p>
-            <w:pPr>
-              <w:rPr>
-                <w:i/>
-                <w:sz w:val="18"/>
-                <w:szCs w:val="18"/>
-              </w:rPr>
-            </w:pPr>
+              <w:t>Día 13</w:t>
+            </w:r>
+            <w:r>
+              <w:t>/05/2026</w:t>
+            </w:r>
+            <w:r>
+              <w:t xml:space="preserve"> (miércoles)</w:t>
+            </w:r>
+          </w:p>
+          <w:p>
+            <w:pPr>
+              <w:rPr>
+                <w:i/>
+                <w:sz w:val="18"/>
+                <w:szCs w:val="18"/>
+              </w:rPr>
+            </w:pPr>
+          </w:p>
+          <w:p>
+            <w:pPr>
+              <w:rPr>
+                <w:i/>
+                <w:sz w:val="18"/>
+                <w:szCs w:val="18"/>
+              </w:rPr>
+            </w:pPr>
+            <w:r>
+              <w:rPr>
+                <w:i/>
+                <w:sz w:val="18"/>
+                <w:szCs w:val="18"/>
+              </w:rPr>
+              <w:t>Hoy hemos tenido un problema con la carpeta de GitHub. Hemos mergeado cosas y hecho commits y nos hemos liado con las ramas. Hemos creado otro repositorio para empezar de nuevo con las ramas y los commits y hemos vuelto a poner todo el contenido del anterior repositorio y hemos seguido haciendo cambios en el nuevo repositorio. Ahora está mucho más ordenado y cada uno edita y hace cambios en su propia rama y para al final mergearlo en la rama principal (master).</w:t>
+            </w:r>
+          </w:p>
+          <w:p>
+            <w:pPr>
+              <w:rPr>
+                <w:i/>
+                <w:sz w:val="18"/>
+                <w:szCs w:val="18"/>
+              </w:rPr>
+            </w:pPr>
+          </w:p>
+          <w:p>
+            <w:pPr>
+              <w:rPr>
+                <w:i/>
+                <w:sz w:val="18"/>
+                <w:szCs w:val="18"/>
+              </w:rPr>
+            </w:pPr>
+          </w:p>
+          <w:p>
+            <w:pPr>
+              <w:rPr>
+                <w:i/>
+                <w:sz w:val="18"/>
+                <w:szCs w:val="18"/>
+              </w:rPr>
+            </w:pPr>
+            <w:bookmarkStart w:id="0" w:name="_GoBack"/>
+            <w:bookmarkEnd w:id="0"/>
           </w:p>
           <w:p>
             <w:pPr>
@@ -1379,7 +1504,13 @@
               </w:pBdr>
             </w:pPr>
             <w:r>
-              <w:t>Día 7</w:t>
+              <w:t>Día 14</w:t>
+            </w:r>
+            <w:r>
+              <w:t>/05/2026</w:t>
+            </w:r>
+            <w:r>
+              <w:t xml:space="preserve"> (jueves)</w:t>
             </w:r>
           </w:p>
           <w:p/>
@@ -1403,7 +1534,13 @@
               </w:pBdr>
             </w:pPr>
             <w:r>
-              <w:t>Día 8</w:t>
+              <w:t>Día 15</w:t>
+            </w:r>
+            <w:r>
+              <w:t>/05/2026</w:t>
+            </w:r>
+            <w:r>
+              <w:t xml:space="preserve"> (viernes)</w:t>
             </w:r>
           </w:p>
           <w:p/>
@@ -1428,7 +1565,13 @@
               </w:pBdr>
             </w:pPr>
             <w:r>
-              <w:t>Día 9</w:t>
+              <w:t>Día 18</w:t>
+            </w:r>
+            <w:r>
+              <w:t>/05/2026</w:t>
+            </w:r>
+            <w:r>
+              <w:t xml:space="preserve"> (lunes)</w:t>
             </w:r>
           </w:p>
           <w:p/>
@@ -1446,6 +1589,15 @@
             </w:pPr>
             <w:r>
               <w:t xml:space="preserve">Día </w:t>
+            </w:r>
+            <w:r>
+              <w:t>19</w:t>
+            </w:r>
+            <w:r>
+              <w:t>/05/2026</w:t>
+            </w:r>
+            <w:r>
+              <w:t xml:space="preserve"> (martes)</w:t>
             </w:r>
           </w:p>
           <w:p/>
@@ -1521,6 +1673,15 @@
             <w:r>
               <w:t>Día</w:t>
             </w:r>
+            <w:r>
+              <w:t xml:space="preserve"> 20</w:t>
+            </w:r>
+            <w:r>
+              <w:t>/05/2026</w:t>
+            </w:r>
+            <w:r>
+              <w:t xml:space="preserve"> (miércoles)</w:t>
+            </w:r>
           </w:p>
           <w:p>
             <w:pPr>
@@ -1608,6 +1769,15 @@
             <w:r>
               <w:t>Día</w:t>
             </w:r>
+            <w:r>
+              <w:t xml:space="preserve"> 21</w:t>
+            </w:r>
+            <w:r>
+              <w:t>/05/2026</w:t>
+            </w:r>
+            <w:r>
+              <w:t xml:space="preserve"> (jueves)</w:t>
+            </w:r>
           </w:p>
           <w:p/>
           <w:p>
@@ -1632,6 +1802,15 @@
             <w:r>
               <w:t>Día</w:t>
             </w:r>
+            <w:r>
+              <w:t xml:space="preserve"> 22</w:t>
+            </w:r>
+            <w:r>
+              <w:t>/05/2026</w:t>
+            </w:r>
+            <w:r>
+              <w:t xml:space="preserve"> (viernes)</w:t>
+            </w:r>
           </w:p>
           <w:p/>
           <w:p>
@@ -1657,6 +1836,15 @@
             <w:r>
               <w:t xml:space="preserve">Día </w:t>
             </w:r>
+            <w:r>
+              <w:t>25</w:t>
+            </w:r>
+            <w:r>
+              <w:t>/05/2026</w:t>
+            </w:r>
+            <w:r>
+              <w:t xml:space="preserve"> (lunes)</w:t>
+            </w:r>
           </w:p>
           <w:p/>
         </w:tc>
@@ -1672,6 +1860,15 @@
             </w:pPr>
             <w:r>
               <w:t xml:space="preserve">Día </w:t>
+            </w:r>
+            <w:r>
+              <w:t>26</w:t>
+            </w:r>
+            <w:r>
+              <w:t>/05/2026</w:t>
+            </w:r>
+            <w:r>
+              <w:t xml:space="preserve"> (martes)</w:t>
             </w:r>
           </w:p>
           <w:p/>

</xml_diff>